<commit_message>
Updated links in interview, updated docx template to be more dynamic, and hoping that pushing to github will create a pyproject.toml file
</commit_message>
<xml_diff>
--- a/docassemble/EnforcingChildCustody/data/templates/enforcing_child_custody_action_plan.docx
+++ b/docassemble/EnforcingChildCustody/data/templates/enforcing_child_custody_action_plan.docx
@@ -47,7 +47,21 @@
               <w:rPr>
                 <w:rFonts w:eastAsia="Arial"/>
               </w:rPr>
-              <w:t>{ all_variables(special='metadata').get(</w:t>
+              <w:t xml:space="preserve">{ </w:t>
+            </w:r>
+            <w:proofErr w:type="spellStart"/>
+            <w:r>
+              <w:rPr>
+                <w:rFonts w:eastAsia="Arial"/>
+              </w:rPr>
+              <w:t>all_variables</w:t>
+            </w:r>
+            <w:proofErr w:type="spellEnd"/>
+            <w:r>
+              <w:rPr>
+                <w:rFonts w:eastAsia="Arial"/>
+              </w:rPr>
+              <w:t>(special='metadata').get(</w:t>
             </w:r>
             <w:r>
               <w:rPr>
@@ -764,42 +778,15 @@
               <w:spacing w:before="800"/>
             </w:pPr>
             <w:r>
-              <w:t xml:space="preserve">Your Action Plan in </w:t>
-            </w:r>
-            <w:r>
-              <w:rPr>
-                <w:rFonts w:eastAsia="Arial"/>
-              </w:rPr>
-              <w:fldChar w:fldCharType="begin"/>
-            </w:r>
-            <w:r>
-              <w:instrText xml:space="preserve"> REF  LastStep </w:instrText>
-            </w:r>
-            <w:r>
-              <w:instrText xml:space="preserve"> \* MERGEFORMAT </w:instrText>
-            </w:r>
-            <w:r>
-              <w:rPr>
-                <w:rFonts w:eastAsia="Arial"/>
-              </w:rPr>
-              <w:fldChar w:fldCharType="separate"/>
-            </w:r>
-            <w:r>
-              <w:rPr>
-                <w:rStyle w:val="NumChar"/>
-                <w:noProof/>
-              </w:rPr>
-              <w:t>4</w:t>
-            </w:r>
-            <w:r>
-              <w:rPr>
-                <w:rStyle w:val="NumChar"/>
-                <w:noProof/>
-              </w:rPr>
-              <w:fldChar w:fldCharType="end"/>
-            </w:r>
-            <w:r>
-              <w:t xml:space="preserve"> Steps</w:t>
+              <w:t xml:space="preserve">Your Action Plan in {{ </w:t>
+            </w:r>
+            <w:proofErr w:type="spellStart"/>
+            <w:r>
+              <w:t>step_list</w:t>
+            </w:r>
+            <w:proofErr w:type="spellEnd"/>
+            <w:r>
+              <w:t xml:space="preserve"> | length }} steps</w:t>
             </w:r>
           </w:p>
         </w:tc>
@@ -854,7 +841,6 @@
           <w:p>
             <w:pPr>
               <w:pStyle w:val="BodyText"/>
-              <w:jc w:val="center"/>
               <w:rPr>
                 <w:shd w:val="clear" w:color="auto" w:fill="FFFFFF"/>
               </w:rPr>
@@ -862,8 +848,13 @@
             <w:r>
               <w:t xml:space="preserve">{%tr if </w:t>
             </w:r>
-            <w:r>
-              <w:t>order_type['child support']</w:t>
+            <w:proofErr w:type="spellStart"/>
+            <w:r>
+              <w:t>order_type</w:t>
+            </w:r>
+            <w:proofErr w:type="spellEnd"/>
+            <w:r>
+              <w:t>['child support']</w:t>
             </w:r>
             <w:r>
               <w:t xml:space="preserve"> %}</w:t>
@@ -904,62 +895,18 @@
               </w:rPr>
             </w:pPr>
             <w:r>
-              <w:t xml:space="preserve">Step </w:t>
-            </w:r>
-            <w:r>
-              <w:rPr>
-                <w:rStyle w:val="NumChar"/>
-              </w:rPr>
-              <w:fldChar w:fldCharType="begin"/>
-            </w:r>
-            <w:r>
-              <w:rPr>
-                <w:rStyle w:val="NumChar"/>
-              </w:rPr>
-              <w:instrText xml:space="preserve"> SEQ stepList \* Arabic \* MERGEFORMAT </w:instrText>
-            </w:r>
-            <w:r>
-              <w:rPr>
-                <w:rStyle w:val="NumChar"/>
-              </w:rPr>
-              <w:fldChar w:fldCharType="separate"/>
-            </w:r>
-            <w:r>
-              <w:rPr>
-                <w:rStyle w:val="NumChar"/>
-                <w:noProof/>
-              </w:rPr>
-              <w:t>1</w:t>
-            </w:r>
-            <w:r>
-              <w:rPr>
-                <w:rStyle w:val="NumChar"/>
-              </w:rPr>
-              <w:fldChar w:fldCharType="end"/>
-            </w:r>
-            <w:r>
-              <w:t xml:space="preserve">: </w:t>
-            </w:r>
-            <w:r>
-              <w:t xml:space="preserve">Enforcing a </w:t>
-            </w:r>
-            <w:r>
-              <w:t>c</w:t>
-            </w:r>
-            <w:r>
-              <w:t xml:space="preserve">hild </w:t>
-            </w:r>
-            <w:r>
-              <w:t>s</w:t>
-            </w:r>
-            <w:r>
-              <w:t xml:space="preserve">upport </w:t>
-            </w:r>
-            <w:r>
-              <w:t>o</w:t>
-            </w:r>
-            <w:r>
-              <w:t>rder</w:t>
+              <w:t xml:space="preserve">{{ </w:t>
+            </w:r>
+            <w:proofErr w:type="spellStart"/>
+            <w:r>
+              <w:t>child_support_step</w:t>
+            </w:r>
+            <w:r>
+              <w:t>.subject</w:t>
+            </w:r>
+            <w:proofErr w:type="spellEnd"/>
+            <w:r>
+              <w:t xml:space="preserve"> }}</w:t>
             </w:r>
           </w:p>
         </w:tc>
@@ -975,9 +922,6 @@
           <w:p>
             <w:pPr>
               <w:pStyle w:val="Body"/>
-              <w:rPr>
-                <w:rStyle w:val="Hyperlink"/>
-              </w:rPr>
             </w:pPr>
             <w:r>
               <w:t>Get information about enforcing a child support order</w:t>
@@ -1000,7 +944,7 @@
               <w:br/>
             </w:r>
             <w:r>
-              <w:t>courts.alaska.gov/shc/family/shcenforce.htm#child-support</w:t>
+              <w:t>ak-courts.info/enforce</w:t>
             </w:r>
           </w:p>
           <w:p>
@@ -1031,7 +975,10 @@
               <w:br/>
             </w:r>
             <w:r>
-              <w:t>docassemble.</w:t>
+              <w:t>courtguide</w:t>
+            </w:r>
+            <w:r>
+              <w:t>.</w:t>
             </w:r>
             <w:r>
               <w:t>AK</w:t>
@@ -1042,9 +989,11 @@
             <w:r>
               <w:t xml:space="preserve"> </w:t>
             </w:r>
+            <w:proofErr w:type="spellStart"/>
             <w:r>
               <w:t>ChangingEnforcingChildSupport</w:t>
             </w:r>
+            <w:proofErr w:type="spellEnd"/>
           </w:p>
         </w:tc>
       </w:tr>
@@ -1108,8 +1057,13 @@
             <w:r>
               <w:t xml:space="preserve">{%tr if </w:t>
             </w:r>
-            <w:r>
-              <w:t>order_type[</w:t>
+            <w:proofErr w:type="spellStart"/>
+            <w:r>
+              <w:t>order_type</w:t>
+            </w:r>
+            <w:proofErr w:type="spellEnd"/>
+            <w:r>
+              <w:t>[</w:t>
             </w:r>
             <w:r>
               <w:t>'</w:t>
@@ -1159,47 +1113,21 @@
               </w:rPr>
             </w:pPr>
             <w:r>
-              <w:t xml:space="preserve">Step </w:t>
-            </w:r>
-            <w:r>
-              <w:rPr>
-                <w:rStyle w:val="NumChar"/>
-              </w:rPr>
-              <w:fldChar w:fldCharType="begin"/>
-            </w:r>
-            <w:r>
-              <w:rPr>
-                <w:rStyle w:val="NumChar"/>
-              </w:rPr>
-              <w:instrText xml:space="preserve"> SEQ stepList \* Arabic \* MERGEFORMAT </w:instrText>
-            </w:r>
-            <w:r>
-              <w:rPr>
-                <w:rStyle w:val="NumChar"/>
-              </w:rPr>
-              <w:fldChar w:fldCharType="separate"/>
-            </w:r>
-            <w:r>
-              <w:rPr>
-                <w:rStyle w:val="NumChar"/>
-                <w:noProof/>
-              </w:rPr>
-              <w:t>2</w:t>
-            </w:r>
-            <w:r>
-              <w:rPr>
-                <w:rStyle w:val="NumChar"/>
-              </w:rPr>
-              <w:fldChar w:fldCharType="end"/>
-            </w:r>
-            <w:r>
-              <w:t xml:space="preserve">: </w:t>
-            </w:r>
-            <w:r>
-              <w:t>E</w:t>
-            </w:r>
-            <w:r>
-              <w:t>nforcing a visitation schedule order</w:t>
+              <w:t xml:space="preserve">{{ </w:t>
+            </w:r>
+            <w:proofErr w:type="spellStart"/>
+            <w:r>
+              <w:t>visitation</w:t>
+            </w:r>
+            <w:r>
+              <w:t>_step</w:t>
+            </w:r>
+            <w:r>
+              <w:t>.subject</w:t>
+            </w:r>
+            <w:proofErr w:type="spellEnd"/>
+            <w:r>
+              <w:t xml:space="preserve"> }}</w:t>
             </w:r>
           </w:p>
         </w:tc>
@@ -1229,7 +1157,9 @@
             </w:hyperlink>
             <w:r>
               <w:br/>
-              <w:t>courts.alaska.gov/shc/family/shcenforce.htm#visits</w:t>
+            </w:r>
+            <w:r>
+              <w:t>ak-courts.info/enforce</w:t>
             </w:r>
           </w:p>
         </w:tc>
@@ -1294,14 +1224,18 @@
               </w:rPr>
             </w:pPr>
             <w:r>
-              <w:lastRenderedPageBreak/>
               <w:t xml:space="preserve">{%tr </w:t>
             </w:r>
             <w:r>
               <w:t xml:space="preserve">if </w:t>
             </w:r>
-            <w:r>
-              <w:t>order_type['other']</w:t>
+            <w:proofErr w:type="spellStart"/>
+            <w:r>
+              <w:t>order_type</w:t>
+            </w:r>
+            <w:proofErr w:type="spellEnd"/>
+            <w:r>
+              <w:t>['other']</w:t>
             </w:r>
             <w:r>
               <w:t xml:space="preserve"> </w:t>
@@ -1342,50 +1276,25 @@
               <w:outlineLvl w:val="1"/>
             </w:pPr>
             <w:r>
-              <w:t xml:space="preserve">Step </w:t>
-            </w:r>
-            <w:r>
-              <w:rPr>
-                <w:rStyle w:val="NumChar"/>
-              </w:rPr>
-              <w:fldChar w:fldCharType="begin"/>
-            </w:r>
-            <w:r>
-              <w:rPr>
-                <w:rStyle w:val="NumChar"/>
-              </w:rPr>
-              <w:instrText xml:space="preserve"> SEQ stepList \* Arabic \* MERGEFORMAT </w:instrText>
-            </w:r>
-            <w:r>
-              <w:rPr>
-                <w:rStyle w:val="NumChar"/>
-              </w:rPr>
-              <w:fldChar w:fldCharType="separate"/>
-            </w:r>
-            <w:r>
-              <w:rPr>
-                <w:rStyle w:val="NumChar"/>
-                <w:noProof/>
-              </w:rPr>
-              <w:t>3</w:t>
-            </w:r>
-            <w:r>
-              <w:rPr>
-                <w:rStyle w:val="NumChar"/>
-              </w:rPr>
-              <w:fldChar w:fldCharType="end"/>
-            </w:r>
-            <w:r>
-              <w:t>:</w:t>
-            </w:r>
-            <w:r>
-              <w:t xml:space="preserve"> </w:t>
-            </w:r>
-            <w:r>
-              <w:t>E</w:t>
-            </w:r>
-            <w:r>
-              <w:t>nforcing another court order</w:t>
+              <w:lastRenderedPageBreak/>
+              <w:t xml:space="preserve">{{ </w:t>
+            </w:r>
+            <w:proofErr w:type="spellStart"/>
+            <w:r>
+              <w:t>other_</w:t>
+            </w:r>
+            <w:r>
+              <w:t>order</w:t>
+            </w:r>
+            <w:r>
+              <w:t>_step</w:t>
+            </w:r>
+            <w:r>
+              <w:t>.subject</w:t>
+            </w:r>
+            <w:proofErr w:type="spellEnd"/>
+            <w:r>
+              <w:t xml:space="preserve"> }}</w:t>
             </w:r>
           </w:p>
         </w:tc>
@@ -1415,7 +1324,9 @@
             </w:hyperlink>
             <w:r>
               <w:br/>
-              <w:t>courts.alaska.gov/shc/family/shcenforce.htm#forms</w:t>
+            </w:r>
+            <w:r>
+              <w:t>ak-courts.info/enforce</w:t>
             </w:r>
           </w:p>
         </w:tc>
@@ -1478,49 +1389,15 @@
               <w:outlineLvl w:val="1"/>
             </w:pPr>
             <w:r>
-              <w:t xml:space="preserve">Step </w:t>
-            </w:r>
-            <w:bookmarkStart w:id="2" w:name="LastStep"/>
-            <w:r>
-              <w:rPr>
-                <w:rStyle w:val="NumChar"/>
-              </w:rPr>
-              <w:fldChar w:fldCharType="begin"/>
-            </w:r>
-            <w:r>
-              <w:rPr>
-                <w:rStyle w:val="NumChar"/>
-              </w:rPr>
-              <w:instrText xml:space="preserve"> SEQ stepList \* Arabic \* MERGEFORMAT </w:instrText>
-            </w:r>
-            <w:r>
-              <w:rPr>
-                <w:rStyle w:val="NumChar"/>
-              </w:rPr>
-              <w:fldChar w:fldCharType="separate"/>
-            </w:r>
-            <w:r>
-              <w:rPr>
-                <w:rStyle w:val="NumChar"/>
-                <w:noProof/>
-              </w:rPr>
-              <w:t>4</w:t>
-            </w:r>
-            <w:r>
-              <w:rPr>
-                <w:rStyle w:val="NumChar"/>
-              </w:rPr>
-              <w:fldChar w:fldCharType="end"/>
-            </w:r>
-            <w:bookmarkEnd w:id="2"/>
-            <w:r>
-              <w:t xml:space="preserve">: Get more </w:t>
-            </w:r>
-            <w:r>
-              <w:t>information</w:t>
-            </w:r>
-            <w:r>
-              <w:t xml:space="preserve"> or help</w:t>
+              <w:t xml:space="preserve">{{ </w:t>
+            </w:r>
+            <w:proofErr w:type="spellStart"/>
+            <w:r>
+              <w:t>get_help.subject</w:t>
+            </w:r>
+            <w:proofErr w:type="spellEnd"/>
+            <w:r>
+              <w:t xml:space="preserve"> }}</w:t>
             </w:r>
           </w:p>
         </w:tc>
@@ -1535,181 +1412,10 @@
           </w:tcPr>
           <w:p>
             <w:pPr>
-              <w:pStyle w:val="Body"/>
-            </w:pPr>
-            <w:r>
-              <w:t>For help with forms or understanding the process:</w:t>
-            </w:r>
-          </w:p>
-          <w:p>
-            <w:pPr>
-              <w:pStyle w:val="Body"/>
-            </w:pPr>
-            <w:r>
-              <w:t>Call the Family Law Self-Help Center</w:t>
-            </w:r>
-            <w:r>
-              <w:br/>
-              <w:t>(907) 264-0851 or</w:t>
-            </w:r>
-            <w:r>
-              <w:br/>
-              <w:t>(866) 279-0851</w:t>
-            </w:r>
-          </w:p>
-          <w:p>
-            <w:pPr>
-              <w:pStyle w:val="Body"/>
-            </w:pPr>
-            <w:r>
-              <w:t xml:space="preserve">See the court’s  </w:t>
-            </w:r>
-            <w:hyperlink r:id="rId12">
-              <w:r>
-                <w:rPr>
-                  <w:rStyle w:val="Hyperlink"/>
-                </w:rPr>
-                <w:t>family law self-help</w:t>
-              </w:r>
-            </w:hyperlink>
-            <w:r>
-              <w:t xml:space="preserve"> webpages.</w:t>
-            </w:r>
-          </w:p>
-          <w:p>
-            <w:pPr>
-              <w:pStyle w:val="Body"/>
-            </w:pPr>
-            <w:r>
-              <w:t xml:space="preserve">Many lawyers offer free or flat fee consultations without having to hire them for the whole case. </w:t>
-            </w:r>
-            <w:hyperlink r:id="rId13">
-              <w:r>
-                <w:rPr>
-                  <w:color w:val="0563C1"/>
-                </w:rPr>
-                <w:t>Find a Lawyer</w:t>
-              </w:r>
-            </w:hyperlink>
-            <w:r>
-              <w:t>.</w:t>
-            </w:r>
-          </w:p>
-          <w:p>
-            <w:pPr>
-              <w:pStyle w:val="Body"/>
-            </w:pPr>
-            <w:r>
-              <w:t xml:space="preserve">Depending on your income, you may qualify for </w:t>
-            </w:r>
-            <w:hyperlink r:id="rId14">
-              <w:r>
-                <w:rPr>
-                  <w:color w:val="0563C1"/>
-                </w:rPr>
-                <w:t>Alaska Free Legal Answers</w:t>
-              </w:r>
-            </w:hyperlink>
-            <w:r>
-              <w:t>.</w:t>
-            </w:r>
-          </w:p>
-          <w:p>
-            <w:pPr>
-              <w:pStyle w:val="Body"/>
-            </w:pPr>
-            <w:r>
-              <w:t xml:space="preserve">Depending on your income and circumstances, you may qualify for a free lawyer from </w:t>
-            </w:r>
-            <w:hyperlink r:id="rId15">
-              <w:r>
-                <w:rPr>
-                  <w:color w:val="0563C1"/>
-                </w:rPr>
-                <w:t>Alaska Legal Services</w:t>
-              </w:r>
-            </w:hyperlink>
-            <w:r>
-              <w:t>.</w:t>
-            </w:r>
-          </w:p>
-          <w:p>
-            <w:pPr>
-              <w:pStyle w:val="Heading3"/>
-              <w:keepNext/>
-              <w:keepLines/>
-              <w:outlineLvl w:val="2"/>
-            </w:pPr>
-            <w:r>
-              <w:t>Links in this step</w:t>
-            </w:r>
-          </w:p>
-          <w:p>
-            <w:pPr>
-              <w:pStyle w:val="Body"/>
-            </w:pPr>
-            <w:hyperlink r:id="rId16">
-              <w:r>
-                <w:rPr>
-                  <w:rStyle w:val="Hyperlink"/>
-                </w:rPr>
-                <w:t>family law self-help</w:t>
-              </w:r>
-            </w:hyperlink>
-            <w:r>
-              <w:br/>
-              <w:t>courts.alaska.gov/shc/family</w:t>
-            </w:r>
-          </w:p>
-          <w:p>
-            <w:pPr>
-              <w:pStyle w:val="Body"/>
-            </w:pPr>
-            <w:hyperlink r:id="rId17">
-              <w:r>
-                <w:rPr>
-                  <w:rStyle w:val="Hyperlink"/>
-                </w:rPr>
-                <w:t>Find a Lawyer</w:t>
-              </w:r>
-            </w:hyperlink>
-            <w:r>
-              <w:br/>
-              <w:t>courts.alaska.gov/shc/shclawyer.htm</w:t>
-            </w:r>
-          </w:p>
-          <w:p>
-            <w:pPr>
-              <w:pStyle w:val="Body"/>
-            </w:pPr>
-            <w:hyperlink r:id="rId18">
-              <w:r>
-                <w:rPr>
-                  <w:rStyle w:val="Hyperlink"/>
-                </w:rPr>
-                <w:t>Alaska Free Legal Answers</w:t>
-              </w:r>
-            </w:hyperlink>
-            <w:r>
-              <w:br/>
-              <w:t>alaska.freelegalanswers.org</w:t>
-            </w:r>
-          </w:p>
-          <w:p>
-            <w:pPr>
               <w:pStyle w:val="BodyText"/>
             </w:pPr>
-            <w:hyperlink r:id="rId19">
-              <w:r>
-                <w:rPr>
-                  <w:rStyle w:val="Hyperlink"/>
-                </w:rPr>
-                <w:t>Alaska Legal Services</w:t>
-              </w:r>
-            </w:hyperlink>
-            <w:r>
-              <w:br/>
-              <w:t>alsc-law.org/apply-for-services</w:t>
+            <w:r>
+              <w:t>{{p (include_docx_template("docassemble.AKA2JBranding:get_help_content.docx")) }}</w:t>
             </w:r>
           </w:p>
         </w:tc>
@@ -1721,12 +1427,7 @@
       </w:pPr>
     </w:p>
     <w:sectPr>
-      <w:headerReference w:type="even" r:id="rId20"/>
-      <w:headerReference w:type="default" r:id="rId21"/>
-      <w:footerReference w:type="even" r:id="rId22"/>
-      <w:footerReference w:type="default" r:id="rId23"/>
-      <w:headerReference w:type="first" r:id="rId24"/>
-      <w:footerReference w:type="first" r:id="rId25"/>
+      <w:footerReference w:type="default" r:id="rId12"/>
       <w:pgSz w:w="12240" w:h="15840"/>
       <w:pgMar w:top="245" w:right="1440" w:bottom="274" w:left="1440" w:header="720" w:footer="720" w:gutter="0"/>
       <w:cols w:space="720"/>
@@ -1760,16 +1461,6 @@
   <w:p>
     <w:pPr>
       <w:pStyle w:val="Footer"/>
-    </w:pPr>
-  </w:p>
-</w:ftr>
-</file>
-
-<file path=word/footer2.xml><?xml version="1.0" encoding="utf-8"?>
-<w:ftr xmlns:wpc="http://schemas.microsoft.com/office/word/2010/wordprocessingCanvas" xmlns:cx="http://schemas.microsoft.com/office/drawing/2014/chartex" xmlns:cx1="http://schemas.microsoft.com/office/drawing/2015/9/8/chartex" xmlns:cx2="http://schemas.microsoft.com/office/drawing/2015/10/21/chartex" xmlns:cx3="http://schemas.microsoft.com/office/drawing/2016/5/9/chartex" xmlns:cx4="http://schemas.microsoft.com/office/drawing/2016/5/10/chartex" xmlns:cx5="http://schemas.microsoft.com/office/drawing/2016/5/11/chartex" xmlns:cx6="http://schemas.microsoft.com/office/drawing/2016/5/12/chartex" xmlns:cx7="http://schemas.microsoft.com/office/drawing/2016/5/13/chartex" xmlns:cx8="http://schemas.microsoft.com/office/drawing/2016/5/14/chartex" xmlns:mc="http://schemas.openxmlformats.org/markup-compatibility/2006" xmlns:aink="http://schemas.microsoft.com/office/drawing/2016/ink" xmlns:am3d="http://schemas.microsoft.com/office/drawing/2017/model3d" xmlns:o="urn:schemas-microsoft-com:office:office" xmlns:r="http://schemas.openxmlformats.org/officeDocument/2006/relationships" xmlns:m="http://schemas.openxmlformats.org/officeDocument/2006/math" xmlns:v="urn:schemas-microsoft-com:vml" xmlns:wp14="http://schemas.microsoft.com/office/word/2010/wordprocessingDrawing" xmlns:wp="http://schemas.openxmlformats.org/drawingml/2006/wordprocessingDrawing" xmlns:w10="urn:schemas-microsoft-com:office:word" xmlns:w="http://schemas.openxmlformats.org/wordprocessingml/2006/main" xmlns:w14="http://schemas.microsoft.com/office/word/2010/wordml" xmlns:w15="http://schemas.microsoft.com/office/word/2012/wordml" xmlns:w16cex="http://schemas.microsoft.com/office/word/2018/wordml/cex" xmlns:w16cid="http://schemas.microsoft.com/office/word/2016/wordml/cid" xmlns:w16="http://schemas.microsoft.com/office/word/2018/wordml" xmlns:w16sdtdh="http://schemas.microsoft.com/office/word/2020/wordml/sdtdatahash" xmlns:w16se="http://schemas.microsoft.com/office/word/2015/wordml/symex" xmlns:wpg="http://schemas.microsoft.com/office/word/2010/wordprocessingGroup" xmlns:wpi="http://schemas.microsoft.com/office/word/2010/wordprocessingInk" xmlns:wne="http://schemas.microsoft.com/office/word/2006/wordml" xmlns:wps="http://schemas.microsoft.com/office/word/2010/wordprocessingShape" mc:Ignorable="w14 w15 w16se w16cid w16 w16cex w16sdtdh wp14">
-  <w:p>
-    <w:pPr>
-      <w:pStyle w:val="Footer"/>
       <w:spacing w:before="0" w:beforeAutospacing="0" w:after="0" w:afterAutospacing="0"/>
       <w:jc w:val="right"/>
     </w:pPr>
@@ -1812,18 +1503,20 @@
       <w:spacing w:before="0" w:beforeAutospacing="0" w:after="0" w:afterAutospacing="0"/>
     </w:pPr>
     <w:r>
-      <w:t>March 13, 2025</w:t>
+      <w:t>October</w:t>
     </w:r>
-  </w:p>
-</w:ftr>
-</file>
-
-<file path=word/footer3.xml><?xml version="1.0" encoding="utf-8"?>
-<w:ftr xmlns:wpc="http://schemas.microsoft.com/office/word/2010/wordprocessingCanvas" xmlns:cx="http://schemas.microsoft.com/office/drawing/2014/chartex" xmlns:cx1="http://schemas.microsoft.com/office/drawing/2015/9/8/chartex" xmlns:cx2="http://schemas.microsoft.com/office/drawing/2015/10/21/chartex" xmlns:cx3="http://schemas.microsoft.com/office/drawing/2016/5/9/chartex" xmlns:cx4="http://schemas.microsoft.com/office/drawing/2016/5/10/chartex" xmlns:cx5="http://schemas.microsoft.com/office/drawing/2016/5/11/chartex" xmlns:cx6="http://schemas.microsoft.com/office/drawing/2016/5/12/chartex" xmlns:cx7="http://schemas.microsoft.com/office/drawing/2016/5/13/chartex" xmlns:cx8="http://schemas.microsoft.com/office/drawing/2016/5/14/chartex" xmlns:mc="http://schemas.openxmlformats.org/markup-compatibility/2006" xmlns:aink="http://schemas.microsoft.com/office/drawing/2016/ink" xmlns:am3d="http://schemas.microsoft.com/office/drawing/2017/model3d" xmlns:o="urn:schemas-microsoft-com:office:office" xmlns:r="http://schemas.openxmlformats.org/officeDocument/2006/relationships" xmlns:m="http://schemas.openxmlformats.org/officeDocument/2006/math" xmlns:v="urn:schemas-microsoft-com:vml" xmlns:wp14="http://schemas.microsoft.com/office/word/2010/wordprocessingDrawing" xmlns:wp="http://schemas.openxmlformats.org/drawingml/2006/wordprocessingDrawing" xmlns:w10="urn:schemas-microsoft-com:office:word" xmlns:w="http://schemas.openxmlformats.org/wordprocessingml/2006/main" xmlns:w14="http://schemas.microsoft.com/office/word/2010/wordml" xmlns:w15="http://schemas.microsoft.com/office/word/2012/wordml" xmlns:w16cex="http://schemas.microsoft.com/office/word/2018/wordml/cex" xmlns:w16cid="http://schemas.microsoft.com/office/word/2016/wordml/cid" xmlns:w16="http://schemas.microsoft.com/office/word/2018/wordml" xmlns:w16sdtdh="http://schemas.microsoft.com/office/word/2020/wordml/sdtdatahash" xmlns:w16se="http://schemas.microsoft.com/office/word/2015/wordml/symex" xmlns:wpg="http://schemas.microsoft.com/office/word/2010/wordprocessingGroup" xmlns:wpi="http://schemas.microsoft.com/office/word/2010/wordprocessingInk" xmlns:wne="http://schemas.microsoft.com/office/word/2006/wordml" xmlns:wps="http://schemas.microsoft.com/office/word/2010/wordprocessingShape" mc:Ignorable="w14 w15 w16se w16cid w16 w16cex w16sdtdh wp14">
-  <w:p>
-    <w:pPr>
-      <w:pStyle w:val="Footer"/>
-    </w:pPr>
+    <w:r>
+      <w:t xml:space="preserve"> </w:t>
+    </w:r>
+    <w:r>
+      <w:t>30</w:t>
+    </w:r>
+    <w:r>
+      <w:t>, 202</w:t>
+    </w:r>
+    <w:r>
+      <w:t>6</w:t>
+    </w:r>
   </w:p>
 </w:ftr>
 </file>
@@ -1845,36 +1538,6 @@
     </w:p>
   </w:footnote>
 </w:footnotes>
-</file>
-
-<file path=word/header1.xml><?xml version="1.0" encoding="utf-8"?>
-<w:hdr xmlns:wpc="http://schemas.microsoft.com/office/word/2010/wordprocessingCanvas" xmlns:cx="http://schemas.microsoft.com/office/drawing/2014/chartex" xmlns:cx1="http://schemas.microsoft.com/office/drawing/2015/9/8/chartex" xmlns:cx2="http://schemas.microsoft.com/office/drawing/2015/10/21/chartex" xmlns:cx3="http://schemas.microsoft.com/office/drawing/2016/5/9/chartex" xmlns:cx4="http://schemas.microsoft.com/office/drawing/2016/5/10/chartex" xmlns:cx5="http://schemas.microsoft.com/office/drawing/2016/5/11/chartex" xmlns:cx6="http://schemas.microsoft.com/office/drawing/2016/5/12/chartex" xmlns:cx7="http://schemas.microsoft.com/office/drawing/2016/5/13/chartex" xmlns:cx8="http://schemas.microsoft.com/office/drawing/2016/5/14/chartex" xmlns:mc="http://schemas.openxmlformats.org/markup-compatibility/2006" xmlns:aink="http://schemas.microsoft.com/office/drawing/2016/ink" xmlns:am3d="http://schemas.microsoft.com/office/drawing/2017/model3d" xmlns:o="urn:schemas-microsoft-com:office:office" xmlns:r="http://schemas.openxmlformats.org/officeDocument/2006/relationships" xmlns:m="http://schemas.openxmlformats.org/officeDocument/2006/math" xmlns:v="urn:schemas-microsoft-com:vml" xmlns:wp14="http://schemas.microsoft.com/office/word/2010/wordprocessingDrawing" xmlns:wp="http://schemas.openxmlformats.org/drawingml/2006/wordprocessingDrawing" xmlns:w10="urn:schemas-microsoft-com:office:word" xmlns:w="http://schemas.openxmlformats.org/wordprocessingml/2006/main" xmlns:w14="http://schemas.microsoft.com/office/word/2010/wordml" xmlns:w15="http://schemas.microsoft.com/office/word/2012/wordml" xmlns:w16cex="http://schemas.microsoft.com/office/word/2018/wordml/cex" xmlns:w16cid="http://schemas.microsoft.com/office/word/2016/wordml/cid" xmlns:w16="http://schemas.microsoft.com/office/word/2018/wordml" xmlns:w16sdtdh="http://schemas.microsoft.com/office/word/2020/wordml/sdtdatahash" xmlns:w16se="http://schemas.microsoft.com/office/word/2015/wordml/symex" xmlns:wpg="http://schemas.microsoft.com/office/word/2010/wordprocessingGroup" xmlns:wpi="http://schemas.microsoft.com/office/word/2010/wordprocessingInk" xmlns:wne="http://schemas.microsoft.com/office/word/2006/wordml" xmlns:wps="http://schemas.microsoft.com/office/word/2010/wordprocessingShape" mc:Ignorable="w14 w15 w16se w16cid w16 w16cex w16sdtdh wp14">
-  <w:p>
-    <w:pPr>
-      <w:pStyle w:val="Header"/>
-    </w:pPr>
-  </w:p>
-</w:hdr>
-</file>
-
-<file path=word/header2.xml><?xml version="1.0" encoding="utf-8"?>
-<w:hdr xmlns:wpc="http://schemas.microsoft.com/office/word/2010/wordprocessingCanvas" xmlns:cx="http://schemas.microsoft.com/office/drawing/2014/chartex" xmlns:cx1="http://schemas.microsoft.com/office/drawing/2015/9/8/chartex" xmlns:cx2="http://schemas.microsoft.com/office/drawing/2015/10/21/chartex" xmlns:cx3="http://schemas.microsoft.com/office/drawing/2016/5/9/chartex" xmlns:cx4="http://schemas.microsoft.com/office/drawing/2016/5/10/chartex" xmlns:cx5="http://schemas.microsoft.com/office/drawing/2016/5/11/chartex" xmlns:cx6="http://schemas.microsoft.com/office/drawing/2016/5/12/chartex" xmlns:cx7="http://schemas.microsoft.com/office/drawing/2016/5/13/chartex" xmlns:cx8="http://schemas.microsoft.com/office/drawing/2016/5/14/chartex" xmlns:mc="http://schemas.openxmlformats.org/markup-compatibility/2006" xmlns:aink="http://schemas.microsoft.com/office/drawing/2016/ink" xmlns:am3d="http://schemas.microsoft.com/office/drawing/2017/model3d" xmlns:o="urn:schemas-microsoft-com:office:office" xmlns:r="http://schemas.openxmlformats.org/officeDocument/2006/relationships" xmlns:m="http://schemas.openxmlformats.org/officeDocument/2006/math" xmlns:v="urn:schemas-microsoft-com:vml" xmlns:wp14="http://schemas.microsoft.com/office/word/2010/wordprocessingDrawing" xmlns:wp="http://schemas.openxmlformats.org/drawingml/2006/wordprocessingDrawing" xmlns:w10="urn:schemas-microsoft-com:office:word" xmlns:w="http://schemas.openxmlformats.org/wordprocessingml/2006/main" xmlns:w14="http://schemas.microsoft.com/office/word/2010/wordml" xmlns:w15="http://schemas.microsoft.com/office/word/2012/wordml" xmlns:w16cex="http://schemas.microsoft.com/office/word/2018/wordml/cex" xmlns:w16cid="http://schemas.microsoft.com/office/word/2016/wordml/cid" xmlns:w16="http://schemas.microsoft.com/office/word/2018/wordml" xmlns:w16sdtdh="http://schemas.microsoft.com/office/word/2020/wordml/sdtdatahash" xmlns:w16se="http://schemas.microsoft.com/office/word/2015/wordml/symex" xmlns:wpg="http://schemas.microsoft.com/office/word/2010/wordprocessingGroup" xmlns:wpi="http://schemas.microsoft.com/office/word/2010/wordprocessingInk" xmlns:wne="http://schemas.microsoft.com/office/word/2006/wordml" xmlns:wps="http://schemas.microsoft.com/office/word/2010/wordprocessingShape" mc:Ignorable="w14 w15 w16se w16cid w16 w16cex w16sdtdh wp14">
-  <w:p>
-    <w:pPr>
-      <w:pStyle w:val="Header"/>
-    </w:pPr>
-  </w:p>
-</w:hdr>
-</file>
-
-<file path=word/header3.xml><?xml version="1.0" encoding="utf-8"?>
-<w:hdr xmlns:wpc="http://schemas.microsoft.com/office/word/2010/wordprocessingCanvas" xmlns:cx="http://schemas.microsoft.com/office/drawing/2014/chartex" xmlns:cx1="http://schemas.microsoft.com/office/drawing/2015/9/8/chartex" xmlns:cx2="http://schemas.microsoft.com/office/drawing/2015/10/21/chartex" xmlns:cx3="http://schemas.microsoft.com/office/drawing/2016/5/9/chartex" xmlns:cx4="http://schemas.microsoft.com/office/drawing/2016/5/10/chartex" xmlns:cx5="http://schemas.microsoft.com/office/drawing/2016/5/11/chartex" xmlns:cx6="http://schemas.microsoft.com/office/drawing/2016/5/12/chartex" xmlns:cx7="http://schemas.microsoft.com/office/drawing/2016/5/13/chartex" xmlns:cx8="http://schemas.microsoft.com/office/drawing/2016/5/14/chartex" xmlns:mc="http://schemas.openxmlformats.org/markup-compatibility/2006" xmlns:aink="http://schemas.microsoft.com/office/drawing/2016/ink" xmlns:am3d="http://schemas.microsoft.com/office/drawing/2017/model3d" xmlns:o="urn:schemas-microsoft-com:office:office" xmlns:r="http://schemas.openxmlformats.org/officeDocument/2006/relationships" xmlns:m="http://schemas.openxmlformats.org/officeDocument/2006/math" xmlns:v="urn:schemas-microsoft-com:vml" xmlns:wp14="http://schemas.microsoft.com/office/word/2010/wordprocessingDrawing" xmlns:wp="http://schemas.openxmlformats.org/drawingml/2006/wordprocessingDrawing" xmlns:w10="urn:schemas-microsoft-com:office:word" xmlns:w="http://schemas.openxmlformats.org/wordprocessingml/2006/main" xmlns:w14="http://schemas.microsoft.com/office/word/2010/wordml" xmlns:w15="http://schemas.microsoft.com/office/word/2012/wordml" xmlns:w16cex="http://schemas.microsoft.com/office/word/2018/wordml/cex" xmlns:w16cid="http://schemas.microsoft.com/office/word/2016/wordml/cid" xmlns:w16="http://schemas.microsoft.com/office/word/2018/wordml" xmlns:w16sdtdh="http://schemas.microsoft.com/office/word/2020/wordml/sdtdatahash" xmlns:w16se="http://schemas.microsoft.com/office/word/2015/wordml/symex" xmlns:wpg="http://schemas.microsoft.com/office/word/2010/wordprocessingGroup" xmlns:wpi="http://schemas.microsoft.com/office/word/2010/wordprocessingInk" xmlns:wne="http://schemas.microsoft.com/office/word/2006/wordml" xmlns:wps="http://schemas.microsoft.com/office/word/2010/wordprocessingShape" mc:Ignorable="w14 w15 w16se w16cid w16 w16cex w16sdtdh wp14">
-  <w:p>
-    <w:pPr>
-      <w:pStyle w:val="Header"/>
-    </w:pPr>
-  </w:p>
-</w:hdr>
 </file>
 
 <file path=word/numbering.xml><?xml version="1.0" encoding="utf-8"?>

</xml_diff>